<commit_message>
Feat: (Agregar telefonos) Se agrego el modulo que permite agregar telefonos especificos por IMEI.
</commit_message>
<xml_diff>
--- a/Plantillas/Contrato.docx
+++ b/Plantillas/Contrato.docx
@@ -83,22 +83,10 @@
         <w:t>EL VENDEDOR</w:t>
       </w:r>
       <w:r>
-        <w:t xml:space="preserve">; </w:t>
-      </w:r>
-      <w:proofErr w:type="gramStart"/>
-      <w:r>
-        <w:t>y</w:t>
-      </w:r>
-      <w:proofErr w:type="gramEnd"/>
-      <w:r>
-        <w:t xml:space="preserve"> por otra parte, </w:t>
-      </w:r>
-      <w:r>
-        <w:t xml:space="preserve">la </w:t>
-      </w:r>
-      <w:r>
-        <w:t>señora</w:t>
-      </w:r>
+        <w:t xml:space="preserve">; y por otra parte, </w:t>
+      </w:r>
+      <w:bookmarkStart w:id="0" w:name="_GoBack"/>
+      <w:bookmarkEnd w:id="0"/>
       <w:r>
         <w:t xml:space="preserve"> </w:t>
       </w:r>
@@ -302,8 +290,6 @@
         </w:rPr>
         <w:tab/>
       </w:r>
-      <w:bookmarkStart w:id="0" w:name="_GoBack"/>
-      <w:bookmarkEnd w:id="0"/>
       <w:r>
         <w:t xml:space="preserve"> </w:t>
       </w:r>

</xml_diff>